<commit_message>
Finalize MANUSCRIPT_FINAL.docx — submission-ready Word package
2.4 MB DOCX with full submission package:
- Title page: bold/italic species, author placeholders, metadata
  (word count, refs, tables, figures, PROSPERO, funding, COI)
- Highlights (5 bullets)
- Structured Abstract + Keywords
- Sections 1-5 with TNR 12pt body, 1.5 line spacing, 1-inch margins
- 7/7 figures embedded at 6.0-inch centred width with italic 10pt captions
- 9 native Word tables (Light Grid Accent 1 style):
  * Table 1 characteristics, Table 2 interventions, Table 3 QS targets
  * 6 inline tables (cross-database coverage, topics, outcomes, etc.)
- 93 numbered Vancouver references (TNR 10pt, hanging 0.5-inch indent)
- Supplementary Material section (S1-S8)
- PAGE field in section footer for auto-pagination
- Superscript numeric citations; italics on gene/species names

Figure 3A revised in final pass — submission-ready quality.
</commit_message>
<xml_diff>
--- a/systematic-review/MANUSCRIPT_FINAL.docx
+++ b/systematic-review/MANUSCRIPT_FINAL.docx
@@ -109,13 +109,13 @@
           <w:b/>
           <w:sz w:val="22"/>
         </w:rPr>
-        <w:t xml:space="preserve">Word count (main text): </w:t>
+        <w:t xml:space="preserve">Word count (main text, Sections 1–5): </w:t>
       </w:r>
       <w:r>
         <w:rPr>
           <w:sz w:val="22"/>
         </w:rPr>
-        <w:t>14,994</w:t>
+        <w:t>15,516</w:t>
       </w:r>
     </w:p>
     <w:p>
@@ -11049,7 +11049,7 @@
       <w:r>
         <w:drawing>
           <wp:inline xmlns:a="http://schemas.openxmlformats.org/drawingml/2006/main" xmlns:pic="http://schemas.openxmlformats.org/drawingml/2006/picture">
-            <wp:extent cx="5486400" cy="4083548"/>
+            <wp:extent cx="5486400" cy="4529559"/>
             <wp:docPr id="3" name="Picture 3"/>
             <wp:cNvGraphicFramePr>
               <a:graphicFrameLocks noChangeAspect="1"/>
@@ -11070,7 +11070,7 @@
                   <pic:spPr>
                     <a:xfrm>
                       <a:off x="0" y="0"/>
-                      <a:ext cx="5486400" cy="4083548"/>
+                      <a:ext cx="5486400" cy="4529559"/>
                     </a:xfrm>
                     <a:prstGeom prst="rect"/>
                   </pic:spPr>

</xml_diff>